<commit_message>
Cập nhật nội dung 2 file báo cáo
</commit_message>
<xml_diff>
--- a/BaoCaoThucTapChuyenNganh.docx
+++ b/BaoCaoThucTapChuyenNganh.docx
@@ -324,17 +324,47 @@
           <w:szCs w:val="26"/>
           <w:lang w:val="vi-VN"/>
         </w:rPr>
-        <w:t>ThS. TRẦN QUỐC TRƯỜNG</w:t>
-      </w:r>
-      <w:r>
-        <w:rPr>
-          <w:rFonts w:ascii="Times New Roman" w:hAnsi="Times New Roman" w:cs="Times New Roman"/>
+        <w:t>T</w:t>
+      </w:r>
+      <w:r>
+        <w:rPr>
+          <w:rFonts w:ascii="Times New Roman" w:hAnsi="Times New Roman" w:cs="Times New Roman"/>
+          <w:b/>
+          <w:sz w:val="26"/>
+          <w:szCs w:val="26"/>
+          <w:lang w:val="vi-VN"/>
+        </w:rPr>
+        <w:t>hầy</w:t>
+      </w:r>
+      <w:r>
+        <w:rPr>
+          <w:rFonts w:ascii="Times New Roman" w:hAnsi="Times New Roman" w:cs="Times New Roman"/>
+          <w:b/>
           <w:sz w:val="26"/>
           <w:szCs w:val="26"/>
           <w:lang w:val="vi-VN"/>
         </w:rPr>
         <w:t xml:space="preserve"> </w:t>
       </w:r>
+      <w:r>
+        <w:rPr>
+          <w:rFonts w:ascii="Times New Roman" w:hAnsi="Times New Roman" w:cs="Times New Roman"/>
+          <w:b/>
+          <w:sz w:val="26"/>
+          <w:szCs w:val="26"/>
+          <w:lang w:val="vi-VN"/>
+        </w:rPr>
+        <w:t>TRẦN QUỐC TRƯỜNG</w:t>
+      </w:r>
+      <w:r>
+        <w:rPr>
+          <w:rFonts w:ascii="Times New Roman" w:hAnsi="Times New Roman" w:cs="Times New Roman"/>
+          <w:sz w:val="26"/>
+          <w:szCs w:val="26"/>
+          <w:lang w:val="vi-VN"/>
+        </w:rPr>
+        <w:t xml:space="preserve"> </w:t>
+      </w:r>
     </w:p>
     <w:p>
       <w:pPr>
@@ -812,6 +842,7 @@
         <w:rPr>
           <w:rFonts w:ascii="Times New Roman" w:hAnsi="Times New Roman" w:cs="Times New Roman"/>
           <w:b/>
+          <w:noProof/>
           <w:sz w:val="36"/>
           <w:szCs w:val="36"/>
           <w:lang w:val="vi-VN"/>
@@ -3953,6 +3984,18 @@
     </w:p>
     <w:p>
       <w:pPr>
+        <w:jc w:val="center"/>
+        <w:rPr>
+          <w:rFonts w:ascii="Times New Roman" w:hAnsi="Times New Roman" w:cs="Times New Roman"/>
+          <w:b/>
+          <w:sz w:val="36"/>
+          <w:szCs w:val="36"/>
+          <w:lang w:val="vi-VN"/>
+        </w:rPr>
+      </w:pPr>
+    </w:p>
+    <w:p>
+      <w:pPr>
         <w:rPr>
           <w:rFonts w:ascii="Times New Roman" w:hAnsi="Times New Roman" w:cs="Times New Roman"/>
           <w:b/>
@@ -4388,7 +4431,18 @@
           <w:szCs w:val="26"/>
           <w:lang w:val="vi-VN"/>
         </w:rPr>
-        <w:t>Tối ưu trải nghiệm khách hàng khi tìm kiếm và đặt hàng.</w:t>
+        <w:lastRenderedPageBreak/>
+        <w:t xml:space="preserve">Tối ưu trải nghiệm khách </w:t>
+      </w:r>
+      <w:bookmarkStart w:id="8" w:name="_GoBack"/>
+      <w:bookmarkEnd w:id="8"/>
+      <w:r>
+        <w:rPr>
+          <w:sz w:val="26"/>
+          <w:szCs w:val="26"/>
+          <w:lang w:val="vi-VN"/>
+        </w:rPr>
+        <w:t>hàng khi tìm kiếm và đặt hàng.</w:t>
       </w:r>
     </w:p>
     <w:p>
@@ -4421,15 +4475,14 @@
       <w:pPr>
         <w:pStyle w:val="Heading2"/>
       </w:pPr>
-      <w:bookmarkStart w:id="8" w:name="_Toc214145866"/>
-      <w:r>
-        <w:lastRenderedPageBreak/>
+      <w:bookmarkStart w:id="9" w:name="_Toc214145866"/>
+      <w:r>
         <w:t xml:space="preserve">1.4 </w:t>
       </w:r>
       <w:r>
         <w:t>NỘI DUNG</w:t>
       </w:r>
-      <w:bookmarkEnd w:id="8"/>
+      <w:bookmarkEnd w:id="9"/>
     </w:p>
     <w:p>
       <w:pPr>
@@ -4523,14 +4576,14 @@
       <w:pPr>
         <w:pStyle w:val="Heading2"/>
       </w:pPr>
-      <w:bookmarkStart w:id="9" w:name="_Toc214145867"/>
+      <w:bookmarkStart w:id="10" w:name="_Toc214145867"/>
       <w:r>
         <w:t xml:space="preserve">1.5 </w:t>
       </w:r>
       <w:r>
         <w:t>PHẠM VI THỰC HIỆN</w:t>
       </w:r>
-      <w:bookmarkEnd w:id="9"/>
+      <w:bookmarkEnd w:id="10"/>
     </w:p>
     <w:p>
       <w:pPr>
@@ -4602,14 +4655,14 @@
       <w:pPr>
         <w:pStyle w:val="Heading2"/>
       </w:pPr>
-      <w:bookmarkStart w:id="10" w:name="_Toc214145868"/>
+      <w:bookmarkStart w:id="11" w:name="_Toc214145868"/>
       <w:r>
         <w:t xml:space="preserve">1.6 </w:t>
       </w:r>
       <w:r>
         <w:t>KẾT QUẢ CẦN ĐẠT</w:t>
       </w:r>
-      <w:bookmarkEnd w:id="10"/>
+      <w:bookmarkEnd w:id="11"/>
     </w:p>
     <w:tbl>
       <w:tblPr>
@@ -4639,7 +4692,7 @@
                 <w:szCs w:val="26"/>
               </w:rPr>
             </w:pPr>
-            <w:bookmarkStart w:id="11" w:name="_Toc214145869"/>
+            <w:bookmarkStart w:id="12" w:name="_Toc214145869"/>
             <w:r>
               <w:rPr>
                 <w:b w:val="0"/>
@@ -4648,7 +4701,7 @@
               </w:rPr>
               <w:t>STT</w:t>
             </w:r>
-            <w:bookmarkEnd w:id="11"/>
+            <w:bookmarkEnd w:id="12"/>
           </w:p>
         </w:tc>
         <w:tc>
@@ -4666,7 +4719,7 @@
                 <w:szCs w:val="26"/>
               </w:rPr>
             </w:pPr>
-            <w:bookmarkStart w:id="12" w:name="_Toc214145870"/>
+            <w:bookmarkStart w:id="13" w:name="_Toc214145870"/>
             <w:r>
               <w:rPr>
                 <w:b w:val="0"/>
@@ -4675,7 +4728,7 @@
               </w:rPr>
               <w:t>Kết quả cần đạt</w:t>
             </w:r>
-            <w:bookmarkEnd w:id="12"/>
+            <w:bookmarkEnd w:id="13"/>
           </w:p>
         </w:tc>
         <w:tc>
@@ -4693,7 +4746,7 @@
                 <w:szCs w:val="26"/>
               </w:rPr>
             </w:pPr>
-            <w:bookmarkStart w:id="13" w:name="_Toc214145871"/>
+            <w:bookmarkStart w:id="14" w:name="_Toc214145871"/>
             <w:r>
               <w:rPr>
                 <w:b w:val="0"/>
@@ -4702,7 +4755,7 @@
               </w:rPr>
               <w:t>Tiêu chí đánh giá</w:t>
             </w:r>
-            <w:bookmarkEnd w:id="13"/>
+            <w:bookmarkEnd w:id="14"/>
           </w:p>
         </w:tc>
       </w:tr>
@@ -4722,7 +4775,7 @@
                 <w:szCs w:val="26"/>
               </w:rPr>
             </w:pPr>
-            <w:bookmarkStart w:id="14" w:name="_Toc214145872"/>
+            <w:bookmarkStart w:id="15" w:name="_Toc214145872"/>
             <w:r>
               <w:rPr>
                 <w:b w:val="0"/>
@@ -4731,7 +4784,7 @@
               </w:rPr>
               <w:t>1</w:t>
             </w:r>
-            <w:bookmarkEnd w:id="14"/>
+            <w:bookmarkEnd w:id="15"/>
           </w:p>
         </w:tc>
         <w:tc>
@@ -4749,7 +4802,7 @@
                 <w:szCs w:val="26"/>
               </w:rPr>
             </w:pPr>
-            <w:bookmarkStart w:id="15" w:name="_Toc214145873"/>
+            <w:bookmarkStart w:id="16" w:name="_Toc214145873"/>
             <w:r>
               <w:rPr>
                 <w:b w:val="0"/>
@@ -4758,7 +4811,7 @@
               </w:rPr>
               <w:t>Website hoạt động ổn định</w:t>
             </w:r>
-            <w:bookmarkEnd w:id="15"/>
+            <w:bookmarkEnd w:id="16"/>
           </w:p>
         </w:tc>
         <w:tc>
@@ -4776,7 +4829,7 @@
                 <w:szCs w:val="26"/>
               </w:rPr>
             </w:pPr>
-            <w:bookmarkStart w:id="16" w:name="_Toc214145874"/>
+            <w:bookmarkStart w:id="17" w:name="_Toc214145874"/>
             <w:r>
               <w:rPr>
                 <w:b w:val="0"/>
@@ -4785,7 +4838,7 @@
               </w:rPr>
               <w:t>Không bị lỗi, tải trang nhanh, tất cả tính năng chạy trơn tru</w:t>
             </w:r>
-            <w:bookmarkEnd w:id="16"/>
+            <w:bookmarkEnd w:id="17"/>
           </w:p>
         </w:tc>
       </w:tr>
@@ -4805,7 +4858,7 @@
                 <w:szCs w:val="26"/>
               </w:rPr>
             </w:pPr>
-            <w:bookmarkStart w:id="17" w:name="_Toc214145875"/>
+            <w:bookmarkStart w:id="18" w:name="_Toc214145875"/>
             <w:r>
               <w:rPr>
                 <w:b w:val="0"/>
@@ -4814,7 +4867,7 @@
               </w:rPr>
               <w:t>2</w:t>
             </w:r>
-            <w:bookmarkEnd w:id="17"/>
+            <w:bookmarkEnd w:id="18"/>
           </w:p>
         </w:tc>
         <w:tc>
@@ -4832,7 +4885,7 @@
                 <w:szCs w:val="26"/>
               </w:rPr>
             </w:pPr>
-            <w:bookmarkStart w:id="18" w:name="_Toc214145876"/>
+            <w:bookmarkStart w:id="19" w:name="_Toc214145876"/>
             <w:r>
               <w:rPr>
                 <w:b w:val="0"/>
@@ -4841,7 +4894,7 @@
               </w:rPr>
               <w:t>Quản lý sản phẩm và danh mục</w:t>
             </w:r>
-            <w:bookmarkEnd w:id="18"/>
+            <w:bookmarkEnd w:id="19"/>
           </w:p>
         </w:tc>
         <w:tc>
@@ -4859,7 +4912,7 @@
                 <w:szCs w:val="26"/>
               </w:rPr>
             </w:pPr>
-            <w:bookmarkStart w:id="19" w:name="_Toc214145877"/>
+            <w:bookmarkStart w:id="20" w:name="_Toc214145877"/>
             <w:r>
               <w:rPr>
                 <w:b w:val="0"/>
@@ -4868,7 +4921,7 @@
               </w:rPr>
               <w:t>Có thể thêm, sửa, xóa sản phẩm/danh mục dễ dàng</w:t>
             </w:r>
-            <w:bookmarkEnd w:id="19"/>
+            <w:bookmarkEnd w:id="20"/>
           </w:p>
         </w:tc>
       </w:tr>
@@ -4888,7 +4941,7 @@
                 <w:szCs w:val="26"/>
               </w:rPr>
             </w:pPr>
-            <w:bookmarkStart w:id="20" w:name="_Toc214145878"/>
+            <w:bookmarkStart w:id="21" w:name="_Toc214145878"/>
             <w:r>
               <w:rPr>
                 <w:b w:val="0"/>
@@ -4897,7 +4950,7 @@
               </w:rPr>
               <w:t>3</w:t>
             </w:r>
-            <w:bookmarkEnd w:id="20"/>
+            <w:bookmarkEnd w:id="21"/>
           </w:p>
         </w:tc>
         <w:tc>
@@ -4915,7 +4968,7 @@
                 <w:szCs w:val="26"/>
               </w:rPr>
             </w:pPr>
-            <w:bookmarkStart w:id="21" w:name="_Toc214145879"/>
+            <w:bookmarkStart w:id="22" w:name="_Toc214145879"/>
             <w:r>
               <w:rPr>
                 <w:b w:val="0"/>
@@ -4924,7 +4977,7 @@
               </w:rPr>
               <w:t>Giỏ hàng và thanh toán hoạt động chính xác</w:t>
             </w:r>
-            <w:bookmarkEnd w:id="21"/>
+            <w:bookmarkEnd w:id="22"/>
           </w:p>
         </w:tc>
         <w:tc>
@@ -4942,7 +4995,7 @@
                 <w:szCs w:val="26"/>
               </w:rPr>
             </w:pPr>
-            <w:bookmarkStart w:id="22" w:name="_Toc214145880"/>
+            <w:bookmarkStart w:id="23" w:name="_Toc214145880"/>
             <w:r>
               <w:rPr>
                 <w:b w:val="0"/>
@@ -4951,7 +5004,7 @@
               </w:rPr>
               <w:t>Tính tổng tiền đúng, đặt hàng thành công, thông báo xác nhận gửi cho khách</w:t>
             </w:r>
-            <w:bookmarkEnd w:id="22"/>
+            <w:bookmarkEnd w:id="23"/>
           </w:p>
         </w:tc>
       </w:tr>
@@ -4971,7 +5024,7 @@
                 <w:szCs w:val="26"/>
               </w:rPr>
             </w:pPr>
-            <w:bookmarkStart w:id="23" w:name="_Toc214145881"/>
+            <w:bookmarkStart w:id="24" w:name="_Toc214145881"/>
             <w:r>
               <w:rPr>
                 <w:b w:val="0"/>
@@ -4980,7 +5033,7 @@
               </w:rPr>
               <w:t>4</w:t>
             </w:r>
-            <w:bookmarkEnd w:id="23"/>
+            <w:bookmarkEnd w:id="24"/>
           </w:p>
         </w:tc>
         <w:tc>
@@ -4998,7 +5051,7 @@
                 <w:szCs w:val="26"/>
               </w:rPr>
             </w:pPr>
-            <w:bookmarkStart w:id="24" w:name="_Toc214145882"/>
+            <w:bookmarkStart w:id="25" w:name="_Toc214145882"/>
             <w:r>
               <w:rPr>
                 <w:b w:val="0"/>
@@ -5007,7 +5060,7 @@
               </w:rPr>
               <w:t>Quản lý đơn hàng và khách hàng</w:t>
             </w:r>
-            <w:bookmarkEnd w:id="24"/>
+            <w:bookmarkEnd w:id="25"/>
           </w:p>
         </w:tc>
         <w:tc>
@@ -5025,7 +5078,7 @@
                 <w:szCs w:val="26"/>
               </w:rPr>
             </w:pPr>
-            <w:bookmarkStart w:id="25" w:name="_Toc214145883"/>
+            <w:bookmarkStart w:id="26" w:name="_Toc214145883"/>
             <w:r>
               <w:rPr>
                 <w:b w:val="0"/>
@@ -5034,7 +5087,7 @@
               </w:rPr>
               <w:t>Hiển thị danh sách đơn hàng, trạng thái, dữ liệu khách hàng đầy đủ</w:t>
             </w:r>
-            <w:bookmarkEnd w:id="25"/>
+            <w:bookmarkEnd w:id="26"/>
           </w:p>
         </w:tc>
       </w:tr>
@@ -5054,7 +5107,7 @@
                 <w:szCs w:val="26"/>
               </w:rPr>
             </w:pPr>
-            <w:bookmarkStart w:id="26" w:name="_Toc214145884"/>
+            <w:bookmarkStart w:id="27" w:name="_Toc214145884"/>
             <w:r>
               <w:rPr>
                 <w:b w:val="0"/>
@@ -5063,7 +5116,7 @@
               </w:rPr>
               <w:t>5</w:t>
             </w:r>
-            <w:bookmarkEnd w:id="26"/>
+            <w:bookmarkEnd w:id="27"/>
           </w:p>
         </w:tc>
         <w:tc>
@@ -5081,7 +5134,7 @@
                 <w:szCs w:val="26"/>
               </w:rPr>
             </w:pPr>
-            <w:bookmarkStart w:id="27" w:name="_Toc214145885"/>
+            <w:bookmarkStart w:id="28" w:name="_Toc214145885"/>
             <w:r>
               <w:rPr>
                 <w:b w:val="0"/>
@@ -5090,7 +5143,7 @@
               </w:rPr>
               <w:t>Hiệu năng tốt</w:t>
             </w:r>
-            <w:bookmarkEnd w:id="27"/>
+            <w:bookmarkEnd w:id="28"/>
           </w:p>
         </w:tc>
         <w:tc>
@@ -5108,7 +5161,7 @@
                 <w:szCs w:val="26"/>
               </w:rPr>
             </w:pPr>
-            <w:bookmarkStart w:id="28" w:name="_Toc214145886"/>
+            <w:bookmarkStart w:id="29" w:name="_Toc214145886"/>
             <w:r>
               <w:rPr>
                 <w:b w:val="0"/>
@@ -5117,7 +5170,7 @@
               </w:rPr>
               <w:t>Tải trang nhanh (&lt;2s), không lag khi nhiều sản phẩm</w:t>
             </w:r>
-            <w:bookmarkEnd w:id="28"/>
+            <w:bookmarkEnd w:id="29"/>
           </w:p>
         </w:tc>
       </w:tr>
@@ -5137,7 +5190,7 @@
                 <w:szCs w:val="26"/>
               </w:rPr>
             </w:pPr>
-            <w:bookmarkStart w:id="29" w:name="_Toc214145887"/>
+            <w:bookmarkStart w:id="30" w:name="_Toc214145887"/>
             <w:r>
               <w:rPr>
                 <w:b w:val="0"/>
@@ -5146,7 +5199,7 @@
               </w:rPr>
               <w:t>6</w:t>
             </w:r>
-            <w:bookmarkEnd w:id="29"/>
+            <w:bookmarkEnd w:id="30"/>
           </w:p>
         </w:tc>
         <w:tc>
@@ -5164,7 +5217,7 @@
                 <w:szCs w:val="26"/>
               </w:rPr>
             </w:pPr>
-            <w:bookmarkStart w:id="30" w:name="_Toc214145888"/>
+            <w:bookmarkStart w:id="31" w:name="_Toc214145888"/>
             <w:r>
               <w:rPr>
                 <w:b w:val="0"/>
@@ -5173,7 +5226,7 @@
               </w:rPr>
               <w:t>Bảo mật cơ bản</w:t>
             </w:r>
-            <w:bookmarkEnd w:id="30"/>
+            <w:bookmarkEnd w:id="31"/>
           </w:p>
         </w:tc>
         <w:tc>
@@ -5191,7 +5244,7 @@
                 <w:szCs w:val="26"/>
               </w:rPr>
             </w:pPr>
-            <w:bookmarkStart w:id="31" w:name="_Toc214145889"/>
+            <w:bookmarkStart w:id="32" w:name="_Toc214145889"/>
             <w:r>
               <w:rPr>
                 <w:b w:val="0"/>
@@ -5200,7 +5253,7 @@
               </w:rPr>
               <w:t>Dữ liệu khách hàng và đơn hàng được bảo vệ, không bị lộ thông tin</w:t>
             </w:r>
-            <w:bookmarkEnd w:id="31"/>
+            <w:bookmarkEnd w:id="32"/>
           </w:p>
         </w:tc>
       </w:tr>
@@ -5234,7 +5287,7 @@
           <w:lang w:val="vi-VN"/>
         </w:rPr>
       </w:pPr>
-      <w:bookmarkStart w:id="32" w:name="_Toc214145890"/>
+      <w:bookmarkStart w:id="33" w:name="_Toc214145890"/>
       <w:r>
         <w:rPr>
           <w:lang w:val="vi-VN"/>
@@ -5242,7 +5295,7 @@
         <w:lastRenderedPageBreak/>
         <w:t>CHƯƠNG 2: PHƯƠNG PHÁP THỰC HIỆN</w:t>
       </w:r>
-      <w:bookmarkEnd w:id="32"/>
+      <w:bookmarkEnd w:id="33"/>
       <w:r>
         <w:rPr>
           <w:lang w:val="vi-VN"/>
@@ -5254,11 +5307,11 @@
       <w:pPr>
         <w:pStyle w:val="Heading2"/>
       </w:pPr>
-      <w:bookmarkStart w:id="33" w:name="_Toc214145891"/>
+      <w:bookmarkStart w:id="34" w:name="_Toc214145891"/>
       <w:r>
         <w:t>2.1 Các hệ thống tương tự</w:t>
       </w:r>
-      <w:bookmarkEnd w:id="33"/>
+      <w:bookmarkEnd w:id="34"/>
       <w:r>
         <w:t xml:space="preserve"> </w:t>
       </w:r>
@@ -5267,7 +5320,7 @@
       <w:pPr>
         <w:pStyle w:val="Heading3"/>
       </w:pPr>
-      <w:bookmarkStart w:id="34" w:name="_Toc214145892"/>
+      <w:bookmarkStart w:id="35" w:name="_Toc214145892"/>
       <w:r>
         <w:t xml:space="preserve">2.1.1 Website bán gấu bông ( </w:t>
       </w:r>
@@ -5285,7 +5338,7 @@
       <w:r>
         <w:t xml:space="preserve"> )</w:t>
       </w:r>
-      <w:bookmarkEnd w:id="34"/>
+      <w:bookmarkEnd w:id="35"/>
       <w:r>
         <w:t xml:space="preserve"> </w:t>
       </w:r>
@@ -5339,6 +5392,7 @@
       <w:r>
         <w:rPr>
           <w:rFonts w:ascii="Times New Roman" w:hAnsi="Times New Roman" w:cs="Times New Roman"/>
+          <w:noProof/>
           <w:sz w:val="36"/>
           <w:szCs w:val="36"/>
           <w:lang w:val="vi-VN"/>
@@ -5596,6 +5650,7 @@
         <w:rPr>
           <w:rFonts w:ascii="Times New Roman" w:hAnsi="Times New Roman" w:cs="Times New Roman"/>
           <w:b/>
+          <w:noProof/>
           <w:sz w:val="36"/>
           <w:szCs w:val="36"/>
           <w:lang w:val="vi-VN"/>
@@ -5805,6 +5860,7 @@
         <w:rPr>
           <w:rFonts w:ascii="Times New Roman" w:hAnsi="Times New Roman" w:cs="Times New Roman"/>
           <w:b/>
+          <w:noProof/>
           <w:sz w:val="36"/>
           <w:szCs w:val="36"/>
           <w:lang w:val="vi-VN"/>
@@ -6040,7 +6096,7 @@
       <w:pPr>
         <w:pStyle w:val="Heading3"/>
       </w:pPr>
-      <w:bookmarkStart w:id="35" w:name="_Toc214145893"/>
+      <w:bookmarkStart w:id="36" w:name="_Toc214145893"/>
       <w:r>
         <w:t xml:space="preserve">2.1.2 Website bán gấu bông ( </w:t>
       </w:r>
@@ -6058,7 +6114,7 @@
       <w:r>
         <w:t xml:space="preserve"> )</w:t>
       </w:r>
-      <w:bookmarkEnd w:id="35"/>
+      <w:bookmarkEnd w:id="36"/>
     </w:p>
     <w:p>
       <w:pPr>
@@ -6095,6 +6151,7 @@
         <w:rPr>
           <w:rFonts w:ascii="Times New Roman" w:hAnsi="Times New Roman" w:cs="Times New Roman"/>
           <w:b/>
+          <w:noProof/>
           <w:sz w:val="26"/>
           <w:szCs w:val="26"/>
           <w:lang w:val="vi-VN"/>
@@ -6346,6 +6403,7 @@
       <w:r>
         <w:rPr>
           <w:rFonts w:ascii="Times New Roman" w:hAnsi="Times New Roman" w:cs="Times New Roman"/>
+          <w:noProof/>
           <w:sz w:val="26"/>
           <w:szCs w:val="26"/>
           <w:lang w:val="vi-VN"/>
@@ -6561,6 +6619,7 @@
       <w:r>
         <w:rPr>
           <w:rFonts w:ascii="Times New Roman" w:hAnsi="Times New Roman" w:cs="Times New Roman"/>
+          <w:noProof/>
           <w:sz w:val="26"/>
           <w:szCs w:val="26"/>
           <w:lang w:val="vi-VN"/>
@@ -6760,11 +6819,11 @@
       <w:pPr>
         <w:pStyle w:val="Heading2"/>
       </w:pPr>
-      <w:bookmarkStart w:id="36" w:name="_Toc214145894"/>
+      <w:bookmarkStart w:id="37" w:name="_Toc214145894"/>
       <w:r>
         <w:t>2.2 Công nghệ sử dụng</w:t>
       </w:r>
-      <w:bookmarkEnd w:id="36"/>
+      <w:bookmarkEnd w:id="37"/>
       <w:r>
         <w:t xml:space="preserve"> </w:t>
       </w:r>
@@ -6778,7 +6837,7 @@
           <w:bCs w:val="0"/>
         </w:rPr>
       </w:pPr>
-      <w:bookmarkStart w:id="37" w:name="_Toc214145895"/>
+      <w:bookmarkStart w:id="38" w:name="_Toc214145895"/>
       <w:r>
         <w:rPr>
           <w:rStyle w:val="Strong"/>
@@ -6787,12 +6846,11 @@
         </w:rPr>
         <w:t>2.2.1 HTML / CSS / JavaScript</w:t>
       </w:r>
-      <w:bookmarkEnd w:id="37"/>
+      <w:bookmarkEnd w:id="38"/>
     </w:p>
     <w:p>
       <w:pPr>
         <w:pStyle w:val="NormalWeb"/>
-        <w:ind w:left="1440"/>
         <w:rPr>
           <w:lang w:val="vi-VN"/>
         </w:rPr>
@@ -6803,52 +6861,37 @@
           <w:rFonts w:eastAsiaTheme="majorEastAsia"/>
           <w:b w:val="0"/>
           <w:bCs w:val="0"/>
-          <w:lang w:val="vi-VN"/>
-        </w:rPr>
-        <w:t xml:space="preserve">- </w:t>
+        </w:rPr>
+        <w:t xml:space="preserve">             </w:t>
       </w:r>
       <w:r>
         <w:rPr>
           <w:rStyle w:val="Strong"/>
           <w:rFonts w:eastAsiaTheme="majorEastAsia"/>
-          <w:lang w:val="vi-VN"/>
-        </w:rPr>
-        <w:t>HTML</w:t>
-      </w:r>
-      <w:r>
-        <w:rPr>
-          <w:lang w:val="vi-VN"/>
-        </w:rPr>
-        <w:t>: Xây dựng cấu trúc trang web như header, footer, trang sản phẩm, giỏ hàng.</w:t>
-      </w:r>
-    </w:p>
-    <w:p>
-      <w:pPr>
-        <w:pStyle w:val="NormalWeb"/>
-        <w:ind w:left="1440"/>
-        <w:rPr>
-          <w:lang w:val="vi-VN"/>
-        </w:rPr>
-      </w:pPr>
+          <w:b w:val="0"/>
+          <w:bCs w:val="0"/>
+          <w:lang w:val="vi-VN"/>
+        </w:rPr>
+        <w:t xml:space="preserve">- </w:t>
+      </w:r>
       <w:r>
         <w:rPr>
           <w:rStyle w:val="Strong"/>
           <w:rFonts w:eastAsiaTheme="majorEastAsia"/>
           <w:lang w:val="vi-VN"/>
         </w:rPr>
-        <w:t>- CSS</w:t>
-      </w:r>
-      <w:r>
-        <w:rPr>
-          <w:lang w:val="vi-VN"/>
-        </w:rPr>
-        <w:t>: Trang trí giao diện, bố cục, màu sắc, font chữ, giúp website đẹp và dễ nhìn.</w:t>
+        <w:t>HTML</w:t>
+      </w:r>
+      <w:r>
+        <w:rPr>
+          <w:lang w:val="vi-VN"/>
+        </w:rPr>
+        <w:t>: Xây dựng cấu trúc trang web như header, footer, trang sản phẩm, giỏ hàng.</w:t>
       </w:r>
     </w:p>
     <w:p>
       <w:pPr>
         <w:pStyle w:val="NormalWeb"/>
-        <w:ind w:left="1440"/>
         <w:rPr>
           <w:lang w:val="vi-VN"/>
         </w:rPr>
@@ -6857,6 +6900,42 @@
         <w:rPr>
           <w:rStyle w:val="Strong"/>
           <w:rFonts w:eastAsiaTheme="majorEastAsia"/>
+        </w:rPr>
+        <w:t xml:space="preserve">             </w:t>
+      </w:r>
+      <w:r>
+        <w:rPr>
+          <w:rStyle w:val="Strong"/>
+          <w:rFonts w:eastAsiaTheme="majorEastAsia"/>
+          <w:lang w:val="vi-VN"/>
+        </w:rPr>
+        <w:t>- CSS</w:t>
+      </w:r>
+      <w:r>
+        <w:rPr>
+          <w:lang w:val="vi-VN"/>
+        </w:rPr>
+        <w:t>: Trang trí giao diện, bố cục, màu sắc, font chữ, giúp website đẹp và dễ nhìn.</w:t>
+      </w:r>
+    </w:p>
+    <w:p>
+      <w:pPr>
+        <w:pStyle w:val="NormalWeb"/>
+        <w:rPr>
+          <w:lang w:val="vi-VN"/>
+        </w:rPr>
+      </w:pPr>
+      <w:r>
+        <w:rPr>
+          <w:rStyle w:val="Strong"/>
+          <w:rFonts w:eastAsiaTheme="majorEastAsia"/>
+        </w:rPr>
+        <w:t xml:space="preserve">             </w:t>
+      </w:r>
+      <w:r>
+        <w:rPr>
+          <w:rStyle w:val="Strong"/>
+          <w:rFonts w:eastAsiaTheme="majorEastAsia"/>
           <w:lang w:val="vi-VN"/>
         </w:rPr>
         <w:t>- JavaScript</w:t>
@@ -6876,7 +6955,7 @@
           <w:b/>
         </w:rPr>
       </w:pPr>
-      <w:bookmarkStart w:id="38" w:name="_Toc214145896"/>
+      <w:bookmarkStart w:id="39" w:name="_Toc214145896"/>
       <w:r>
         <w:rPr>
           <w:rStyle w:val="Strong"/>
@@ -6884,7 +6963,7 @@
         </w:rPr>
         <w:t>2.2.2 Bootstrap4</w:t>
       </w:r>
-      <w:bookmarkEnd w:id="38"/>
+      <w:bookmarkEnd w:id="39"/>
     </w:p>
     <w:p>
       <w:pPr>
@@ -6934,7 +7013,7 @@
       <w:pPr>
         <w:pStyle w:val="Heading3"/>
       </w:pPr>
-      <w:bookmarkStart w:id="39" w:name="_Toc214145897"/>
+      <w:bookmarkStart w:id="40" w:name="_Toc214145897"/>
       <w:r>
         <w:t xml:space="preserve">2.2.3 </w:t>
       </w:r>
@@ -6946,7 +7025,7 @@
         </w:rPr>
         <w:t>Blade Template Engine (Laravel)</w:t>
       </w:r>
-      <w:bookmarkEnd w:id="39"/>
+      <w:bookmarkEnd w:id="40"/>
     </w:p>
     <w:p>
       <w:pPr>
@@ -6995,7 +7074,7 @@
       <w:pPr>
         <w:pStyle w:val="Heading3"/>
       </w:pPr>
-      <w:bookmarkStart w:id="40" w:name="_Toc214145898"/>
+      <w:bookmarkStart w:id="41" w:name="_Toc214145898"/>
       <w:r>
         <w:rPr>
           <w:rStyle w:val="Strong"/>
@@ -7010,7 +7089,7 @@
         </w:rPr>
         <w:t>PHP (Laravel Framework)</w:t>
       </w:r>
-      <w:bookmarkEnd w:id="40"/>
+      <w:bookmarkEnd w:id="41"/>
     </w:p>
     <w:p>
       <w:pPr>
@@ -7140,14 +7219,13 @@
       <w:pPr>
         <w:pStyle w:val="Heading3"/>
       </w:pPr>
-      <w:bookmarkStart w:id="41" w:name="_Toc214145899"/>
+      <w:bookmarkStart w:id="42" w:name="_Toc214145899"/>
       <w:r>
         <w:rPr>
           <w:rStyle w:val="Strong"/>
           <w:b/>
           <w:bCs w:val="0"/>
         </w:rPr>
-        <w:lastRenderedPageBreak/>
         <w:t xml:space="preserve">2.2.5 </w:t>
       </w:r>
       <w:r>
@@ -7165,7 +7243,7 @@
         </w:rPr>
         <w:t>SB Admin (Bootstrap 4))</w:t>
       </w:r>
-      <w:bookmarkEnd w:id="41"/>
+      <w:bookmarkEnd w:id="42"/>
     </w:p>
     <w:p>
       <w:pPr>
@@ -7226,6 +7304,7 @@
           <w:szCs w:val="26"/>
           <w:lang w:val="vi-VN"/>
         </w:rPr>
+        <w:lastRenderedPageBreak/>
         <w:t xml:space="preserve">- </w:t>
       </w:r>
       <w:r>
@@ -7313,11 +7392,11 @@
       <w:pPr>
         <w:pStyle w:val="Heading2"/>
       </w:pPr>
-      <w:bookmarkStart w:id="42" w:name="_Toc214145900"/>
+      <w:bookmarkStart w:id="43" w:name="_Toc214145900"/>
       <w:r>
         <w:t>2.3 Phân tích yêu cầu</w:t>
       </w:r>
-      <w:bookmarkEnd w:id="42"/>
+      <w:bookmarkEnd w:id="43"/>
       <w:r>
         <w:t xml:space="preserve"> </w:t>
       </w:r>
@@ -7326,7 +7405,7 @@
       <w:pPr>
         <w:pStyle w:val="Heading3"/>
       </w:pPr>
-      <w:bookmarkStart w:id="43" w:name="_Toc214145901"/>
+      <w:bookmarkStart w:id="44" w:name="_Toc214145901"/>
       <w:r>
         <w:t>2.3.</w:t>
       </w:r>
@@ -7336,7 +7415,7 @@
       <w:r>
         <w:t xml:space="preserve"> Sơ đồ UML đơn giản</w:t>
       </w:r>
-      <w:bookmarkEnd w:id="43"/>
+      <w:bookmarkEnd w:id="44"/>
       <w:r>
         <w:t xml:space="preserve"> </w:t>
       </w:r>
@@ -7345,7 +7424,7 @@
       <w:pPr>
         <w:pStyle w:val="Heading4"/>
       </w:pPr>
-      <w:bookmarkStart w:id="44" w:name="_Toc214145902"/>
+      <w:bookmarkStart w:id="45" w:name="_Toc214145902"/>
       <w:r>
         <w:t>2.3.</w:t>
       </w:r>
@@ -7358,16 +7437,17 @@
       <w:r>
         <w:t xml:space="preserve"> Sơ đồ D0</w:t>
       </w:r>
-      <w:bookmarkEnd w:id="44"/>
-    </w:p>
-    <w:p>
-      <w:pPr>
-        <w:rPr>
-          <w:lang w:val="vi-VN"/>
-        </w:rPr>
-      </w:pPr>
-      <w:r>
-        <w:rPr>
+      <w:bookmarkEnd w:id="45"/>
+    </w:p>
+    <w:p>
+      <w:pPr>
+        <w:rPr>
+          <w:lang w:val="vi-VN"/>
+        </w:rPr>
+      </w:pPr>
+      <w:r>
+        <w:rPr>
+          <w:noProof/>
           <w:lang w:val="vi-VN"/>
         </w:rPr>
         <w:drawing>
@@ -7411,7 +7491,7 @@
       <w:pPr>
         <w:pStyle w:val="Heading4"/>
       </w:pPr>
-      <w:bookmarkStart w:id="45" w:name="_Toc214145903"/>
+      <w:bookmarkStart w:id="46" w:name="_Toc214145903"/>
       <w:r>
         <w:t>2.3.</w:t>
       </w:r>
@@ -7424,16 +7504,17 @@
       <w:r>
         <w:t xml:space="preserve"> Sơ đồ D1</w:t>
       </w:r>
-      <w:bookmarkEnd w:id="45"/>
-    </w:p>
-    <w:p>
-      <w:pPr>
-        <w:rPr>
-          <w:lang w:val="vi-VN"/>
-        </w:rPr>
-      </w:pPr>
-      <w:r>
-        <w:rPr>
+      <w:bookmarkEnd w:id="46"/>
+    </w:p>
+    <w:p>
+      <w:pPr>
+        <w:rPr>
+          <w:lang w:val="vi-VN"/>
+        </w:rPr>
+      </w:pPr>
+      <w:r>
+        <w:rPr>
+          <w:noProof/>
           <w:lang w:val="vi-VN"/>
         </w:rPr>
         <w:drawing>
@@ -7477,7 +7558,7 @@
       <w:pPr>
         <w:pStyle w:val="Heading4"/>
       </w:pPr>
-      <w:bookmarkStart w:id="46" w:name="_Toc214145904"/>
+      <w:bookmarkStart w:id="47" w:name="_Toc214145904"/>
       <w:r>
         <w:lastRenderedPageBreak/>
         <w:t>2.3.</w:t>
@@ -7491,16 +7572,17 @@
       <w:r>
         <w:t xml:space="preserve"> Sơ đồ D2</w:t>
       </w:r>
-      <w:bookmarkEnd w:id="46"/>
-    </w:p>
-    <w:p>
-      <w:pPr>
-        <w:rPr>
-          <w:lang w:val="vi-VN"/>
-        </w:rPr>
-      </w:pPr>
-      <w:r>
-        <w:rPr>
+      <w:bookmarkEnd w:id="47"/>
+    </w:p>
+    <w:p>
+      <w:pPr>
+        <w:rPr>
+          <w:lang w:val="vi-VN"/>
+        </w:rPr>
+      </w:pPr>
+      <w:r>
+        <w:rPr>
+          <w:noProof/>
           <w:lang w:val="vi-VN"/>
         </w:rPr>
         <w:drawing>
@@ -7539,8 +7621,6 @@
           </wp:inline>
         </w:drawing>
       </w:r>
-      <w:bookmarkStart w:id="47" w:name="_GoBack"/>
-      <w:bookmarkEnd w:id="47"/>
     </w:p>
     <w:p>
       <w:pPr>
@@ -7560,6 +7640,7 @@
       </w:pPr>
       <w:r>
         <w:rPr>
+          <w:noProof/>
           <w:lang w:val="vi-VN"/>
         </w:rPr>
         <w:drawing>
@@ -7599,6 +7680,153 @@
         </w:drawing>
       </w:r>
     </w:p>
+    <w:p>
+      <w:pPr>
+        <w:rPr>
+          <w:lang w:val="vi-VN"/>
+        </w:rPr>
+      </w:pPr>
+    </w:p>
+    <w:p>
+      <w:pPr>
+        <w:rPr>
+          <w:lang w:val="vi-VN"/>
+        </w:rPr>
+      </w:pPr>
+    </w:p>
+    <w:p>
+      <w:pPr>
+        <w:rPr>
+          <w:lang w:val="vi-VN"/>
+        </w:rPr>
+      </w:pPr>
+    </w:p>
+    <w:p>
+      <w:pPr>
+        <w:rPr>
+          <w:lang w:val="vi-VN"/>
+        </w:rPr>
+      </w:pPr>
+    </w:p>
+    <w:p>
+      <w:pPr>
+        <w:jc w:val="center"/>
+        <w:rPr>
+          <w:rFonts w:ascii="Times New Roman" w:hAnsi="Times New Roman" w:cs="Times New Roman"/>
+          <w:b/>
+          <w:sz w:val="36"/>
+          <w:szCs w:val="36"/>
+        </w:rPr>
+      </w:pPr>
+      <w:r>
+        <w:rPr>
+          <w:rFonts w:ascii="Times New Roman" w:hAnsi="Times New Roman" w:cs="Times New Roman"/>
+          <w:b/>
+          <w:sz w:val="36"/>
+          <w:szCs w:val="36"/>
+        </w:rPr>
+        <w:lastRenderedPageBreak/>
+        <w:t>LỜI KẾT</w:t>
+      </w:r>
+    </w:p>
+    <w:p>
+      <w:pPr>
+        <w:spacing w:before="100" w:beforeAutospacing="1" w:after="100" w:afterAutospacing="1" w:line="240" w:lineRule="auto"/>
+        <w:rPr>
+          <w:rFonts w:ascii="Times New Roman" w:eastAsia="Times New Roman" w:hAnsi="Times New Roman" w:cs="Times New Roman"/>
+          <w:sz w:val="26"/>
+          <w:szCs w:val="26"/>
+          <w:lang w:val="vi-VN"/>
+        </w:rPr>
+      </w:pPr>
+      <w:r>
+        <w:rPr>
+          <w:rFonts w:ascii="Times New Roman" w:eastAsia="Times New Roman" w:hAnsi="Times New Roman" w:cs="Times New Roman"/>
+          <w:sz w:val="26"/>
+          <w:szCs w:val="26"/>
+          <w:lang w:val="vi-VN"/>
+        </w:rPr>
+        <w:t>Sau quá trình tìm hiểu và thực hiện đề tài, em đã tích lũy thêm nhiều kiến thức và kinh nghiệm thực tiễn trong lĩnh vực phát triển web – một mảng quan trọng của ngành Công nghệ thông tin. Từ việc phân tích yêu cầu, xây dựng giao diện, thiết kế cơ sở dữ liệu cho đến lập trình các chức năng và kiểm thử ứng dụng, từng bước thực hiện đồ án đã giúp em hiểu rõ hơn quy trình phát triển một website hoàn chỉnh.</w:t>
+      </w:r>
+    </w:p>
+    <w:p>
+      <w:pPr>
+        <w:spacing w:before="100" w:beforeAutospacing="1" w:after="100" w:afterAutospacing="1" w:line="240" w:lineRule="auto"/>
+        <w:rPr>
+          <w:rFonts w:ascii="Times New Roman" w:eastAsia="Times New Roman" w:hAnsi="Times New Roman" w:cs="Times New Roman"/>
+          <w:sz w:val="26"/>
+          <w:szCs w:val="26"/>
+          <w:lang w:val="vi-VN"/>
+        </w:rPr>
+      </w:pPr>
+      <w:r>
+        <w:rPr>
+          <w:rFonts w:ascii="Times New Roman" w:eastAsia="Times New Roman" w:hAnsi="Times New Roman" w:cs="Times New Roman"/>
+          <w:sz w:val="26"/>
+          <w:szCs w:val="26"/>
+          <w:lang w:val="vi-VN"/>
+        </w:rPr>
+        <w:t>Trong quá trình làm, em đã áp dụng các kiến thức về HTML, CSS, JavaScript, Bootstrap, jQuery, PHP/Laravel, cũng như cách tổ chức mã nguồn, quản lý dự án và xử lý lỗi. Đồ án không chỉ giúp em củng cố kiến thức đã học trên lớp mà còn rèn luyện khả năng tự tìm hiểu, đọc tài liệu và giải quyết vấn đề – những kỹ năng rất cần thiết đối với một người làm nghề lập trình.</w:t>
+      </w:r>
+    </w:p>
+    <w:p>
+      <w:pPr>
+        <w:spacing w:before="100" w:beforeAutospacing="1" w:after="100" w:afterAutospacing="1" w:line="240" w:lineRule="auto"/>
+        <w:rPr>
+          <w:rFonts w:ascii="Times New Roman" w:eastAsia="Times New Roman" w:hAnsi="Times New Roman" w:cs="Times New Roman"/>
+          <w:sz w:val="26"/>
+          <w:szCs w:val="26"/>
+          <w:lang w:val="vi-VN"/>
+        </w:rPr>
+      </w:pPr>
+      <w:r>
+        <w:rPr>
+          <w:rFonts w:ascii="Times New Roman" w:eastAsia="Times New Roman" w:hAnsi="Times New Roman" w:cs="Times New Roman"/>
+          <w:sz w:val="26"/>
+          <w:szCs w:val="26"/>
+          <w:lang w:val="vi-VN"/>
+        </w:rPr>
+        <w:t>Bên cạnh đó, việc mô phỏng một ứng dụng web thực tế cho em cơ hội hiểu rõ hơn về nhu cầu người dùng, tính thân thiện giao diện, hiệu suất xử lý, cũng như tầm quan trọng của bảo mật và tối ưu trong phát triển sản phẩm.</w:t>
+      </w:r>
+    </w:p>
+    <w:p>
+      <w:pPr>
+        <w:spacing w:before="100" w:beforeAutospacing="1" w:after="100" w:afterAutospacing="1" w:line="240" w:lineRule="auto"/>
+        <w:rPr>
+          <w:rFonts w:ascii="Times New Roman" w:eastAsia="Times New Roman" w:hAnsi="Times New Roman" w:cs="Times New Roman"/>
+          <w:sz w:val="26"/>
+          <w:szCs w:val="26"/>
+        </w:rPr>
+      </w:pPr>
+      <w:r>
+        <w:rPr>
+          <w:rFonts w:ascii="Times New Roman" w:eastAsia="Times New Roman" w:hAnsi="Times New Roman" w:cs="Times New Roman"/>
+          <w:sz w:val="26"/>
+          <w:szCs w:val="26"/>
+          <w:lang w:val="vi-VN"/>
+        </w:rPr>
+        <w:t>Tuy đã cố gắng hoàn thiện trong phạm vi thời gian cho phép, nhưng do kiến thức và kinh nghiệm còn hạn chế nên đồ án vẫn có thể tồn tại những thiếu sót. Em rất mong nhận được sự góp ý của thầy/cô để em có thể cải thiện và nâng cao kỹ năng lập trình trong những dự án sau</w:t>
+      </w:r>
+      <w:r>
+        <w:rPr>
+          <w:rFonts w:ascii="Times New Roman" w:eastAsia="Times New Roman" w:hAnsi="Times New Roman" w:cs="Times New Roman"/>
+          <w:sz w:val="26"/>
+          <w:szCs w:val="26"/>
+        </w:rPr>
+        <w:t>.</w:t>
+      </w:r>
+    </w:p>
+    <w:p>
+      <w:pPr>
+        <w:spacing w:before="100" w:beforeAutospacing="1" w:after="100" w:afterAutospacing="1" w:line="240" w:lineRule="auto"/>
+        <w:rPr>
+          <w:rFonts w:ascii="Times New Roman" w:eastAsia="Times New Roman" w:hAnsi="Times New Roman" w:cs="Times New Roman"/>
+          <w:sz w:val="26"/>
+          <w:szCs w:val="26"/>
+        </w:rPr>
+      </w:pPr>
+    </w:p>
+    <w:p/>
     <w:sectPr>
       <w:headerReference w:type="default" r:id="rId20"/>
       <w:footerReference w:type="default" r:id="rId21"/>
@@ -12827,7 +13055,7 @@
 </file>
 
 <file path=customXml/itemProps1.xml><?xml version="1.0" encoding="utf-8"?>
-<ds:datastoreItem xmlns:ds="http://schemas.openxmlformats.org/officeDocument/2006/customXml" ds:itemID="{F59CB6F8-D1D7-43C0-AAD9-A9AF2AA9DB8C}">
+<ds:datastoreItem xmlns:ds="http://schemas.openxmlformats.org/officeDocument/2006/customXml" ds:itemID="{FF05053D-6D0B-4AEE-B439-242B34DB754C}">
   <ds:schemaRefs>
     <ds:schemaRef ds:uri="http://schemas.openxmlformats.org/officeDocument/2006/bibliography"/>
   </ds:schemaRefs>

</xml_diff>